<commit_message>
fix(finiquitos): preserve DOCX template layout and split net adjustment placeholders by side
</commit_message>
<xml_diff>
--- a/docx_templates/finiquito_plantilla.docx
+++ b/docx_templates/finiquito_plantilla.docx
@@ -6,37 +6,11 @@
       <w:pPr>
         <w:pStyle w:val="Textoindependiente"/>
         <w:spacing w:before="12"/>
-        <w:ind w:left="4320"/>
+        <w:ind w:right="340"/>
+        <w:jc w:val="right"/>
       </w:pPr>
       <w:r>
-        <w:t xml:space="preserve">             </w:t>
-      </w:r>
-      <w:r>
-        <w:t>{</w:t>
-      </w:r>
-      <w:proofErr w:type="spellStart"/>
-      <w:r>
-        <w:t>lugar_emision</w:t>
-      </w:r>
-      <w:proofErr w:type="spellEnd"/>
-      <w:r>
-        <w:t>}, {</w:t>
-      </w:r>
-      <w:proofErr w:type="spellStart"/>
-      <w:r>
-        <w:t>estado_emision</w:t>
-      </w:r>
-      <w:proofErr w:type="spellEnd"/>
-      <w:r>
-        <w:t>} a {</w:t>
-      </w:r>
-      <w:proofErr w:type="spellStart"/>
-      <w:r>
-        <w:t>fecha_emision_larga</w:t>
-      </w:r>
-      <w:proofErr w:type="spellEnd"/>
-      <w:r>
-        <w:t>}.</w:t>
+        <w:t>{lugar_emision}, {estado_emision} a {fecha_emision_larga}.</w:t>
       </w:r>
     </w:p>
     <w:p>
@@ -51,78 +25,11 @@
     <w:p>
       <w:pPr>
         <w:pStyle w:val="Textoindependiente"/>
-        <w:ind w:left="465" w:right="873"/>
+        <w:ind w:left="170" w:right="397"/>
         <w:jc w:val="both"/>
       </w:pPr>
       <w:r>
-        <w:t>Recibí de la</w:t>
-      </w:r>
-      <w:r>
-        <w:rPr>
-          <w:spacing w:val="-2"/>
-        </w:rPr>
-        <w:t xml:space="preserve"> </w:t>
-      </w:r>
-      <w:r>
-        <w:t xml:space="preserve">empresa </w:t>
-      </w:r>
-      <w:r>
-        <w:rPr>
-          <w:b/>
-          <w:bCs/>
-        </w:rPr>
-        <w:t>RAFAEL</w:t>
-      </w:r>
-      <w:r>
-        <w:rPr>
-          <w:b/>
-          <w:bCs/>
-          <w:spacing w:val="-7"/>
-        </w:rPr>
-        <w:t xml:space="preserve"> </w:t>
-      </w:r>
-      <w:r>
-        <w:rPr>
-          <w:b/>
-          <w:bCs/>
-        </w:rPr>
-        <w:t>ALEJANDRO VILLALOBOS GARZA</w:t>
-      </w:r>
-      <w:r>
-        <w:rPr>
-          <w:spacing w:val="-10"/>
-        </w:rPr>
-        <w:t xml:space="preserve"> </w:t>
-      </w:r>
-      <w:r>
-        <w:t>con domicilio en</w:t>
-      </w:r>
-      <w:r>
-        <w:rPr>
-          <w:spacing w:val="40"/>
-        </w:rPr>
-        <w:t xml:space="preserve"> </w:t>
-      </w:r>
-      <w:r>
-        <w:t>CALLE CASSINO 1216 CUMBRES SAN AGUSTIN 2DO SECTOR 2DA</w:t>
-      </w:r>
-      <w:r>
-        <w:rPr>
-          <w:spacing w:val="-1"/>
-        </w:rPr>
-        <w:t xml:space="preserve"> </w:t>
-      </w:r>
-      <w:r>
-        <w:t>ETAPA</w:t>
-      </w:r>
-      <w:r>
-        <w:rPr>
-          <w:spacing w:val="-3"/>
-        </w:rPr>
-        <w:t xml:space="preserve"> </w:t>
-      </w:r>
-      <w:r>
-        <w:t xml:space="preserve">la cantidad de </w:t>
+        <w:t xml:space="preserve">La empresa RAFAEL ALEJANDRO VILLALOBOS GARZA, con domicilio en CALLE CASSINO 1216, CUMBRES SAN AGUSTÍN 2DO SECTOR 2DA ETAPA, reconoce adeudar a la persona trabajadora la cantidad de </w:t>
       </w:r>
       <w:r>
         <w:rPr>
@@ -130,93 +37,41 @@
           <w:bCs/>
           <w:u w:val="single"/>
         </w:rPr>
-        <w:t>$</w:t>
+        <w:t>${neto_p}</w:t>
       </w:r>
       <w:r>
-        <w:rPr>
-          <w:rFonts w:ascii="Arial"/>
-          <w:b/>
-          <w:spacing w:val="-2"/>
-          <w:position w:val="2"/>
-          <w:sz w:val="18"/>
-        </w:rPr>
-        <w:t>{</w:t>
-      </w:r>
-      <w:proofErr w:type="spellStart"/>
-      <w:r>
-        <w:rPr>
-          <w:rFonts w:ascii="Arial"/>
-          <w:b/>
-          <w:spacing w:val="-2"/>
-          <w:position w:val="2"/>
-          <w:sz w:val="18"/>
-        </w:rPr>
-        <w:t>neto_p</w:t>
-      </w:r>
-      <w:proofErr w:type="spellEnd"/>
-      <w:r>
-        <w:rPr>
-          <w:rFonts w:ascii="Arial"/>
-          <w:b/>
-          <w:spacing w:val="-2"/>
-          <w:position w:val="2"/>
-          <w:sz w:val="18"/>
-        </w:rPr>
-        <w:t>}</w:t>
+        <w:t xml:space="preserve"> {neto_pagar_letra} por concepto de finiquito, </w:t>
       </w:r>
       <w:r>
-        <w:rPr>
-          <w:rFonts w:ascii="Arial"/>
-          <w:b/>
-          <w:spacing w:val="-2"/>
-          <w:position w:val="2"/>
-          <w:sz w:val="18"/>
-        </w:rPr>
-        <w:t xml:space="preserve"> </w:t>
+        <w:t>l</w:t>
       </w:r>
       <w:r>
-        <w:t>{</w:t>
+        <w:t xml:space="preserve">as partes acuerdan que dicha cantidad </w:t>
       </w:r>
-      <w:proofErr w:type="spellStart"/>
       <w:r>
-        <w:t>neto_pagar_letra</w:t>
+        <w:t>será cubierta a más tardar el día {fecha_limite_pago}</w:t>
       </w:r>
-      <w:proofErr w:type="spellEnd"/>
       <w:r>
-        <w:t>}</w:t>
+        <w:t>, teniéndose por cumplida la obligación de pago</w:t>
+      </w:r>
+      <w:r>
+        <w:t xml:space="preserve"> por medio de transferencia electrónica</w:t>
+      </w:r>
+      <w:r>
+        <w:t xml:space="preserve"> una vez que el importe quede efectivamente depositado o entregado a la persona trabajadora</w:t>
       </w:r>
       <w:r>
         <w:t xml:space="preserve"> </w:t>
       </w:r>
       <w:r>
-        <w:t>por</w:t>
+        <w:t xml:space="preserve">con motivo de la terminación de la relación laboral con fecha </w:t>
       </w:r>
       <w:r>
-        <w:rPr>
-          <w:spacing w:val="40"/>
-        </w:rPr>
-        <w:t xml:space="preserve"> </w:t>
+        <w:t xml:space="preserve">del día </w:t>
       </w:r>
       <w:r>
-        <w:t xml:space="preserve">concepto de mi finiquito, con motivo de la terminación de mi relación laboral con la empresa con fecha </w:t>
+        <w:t>{fecha_letra}, importe que resulta de los conceptos que se desglosan a continuación.</w:t>
       </w:r>
-      <w:r>
-        <w:t xml:space="preserve">del jueves </w:t>
-      </w:r>
-      <w:r>
-        <w:t xml:space="preserve">26 de </w:t>
-      </w:r>
-      <w:r>
-        <w:t>m</w:t>
-      </w:r>
-      <w:r>
-        <w:t>arzo de 2026, cantidad que resulta de los siguientes conceptos:</w:t>
-      </w:r>
-    </w:p>
-    <w:p>
-      <w:pPr>
-        <w:pStyle w:val="Textoindependiente"/>
-      </w:pPr>
     </w:p>
     <w:p>
       <w:pPr>
@@ -648,23 +503,7 @@
                 <w:color w:val="808080"/>
                 <w:sz w:val="18"/>
               </w:rPr>
-              <w:t>{</w:t>
-            </w:r>
-            <w:proofErr w:type="spellStart"/>
-            <w:r>
-              <w:rPr>
-                <w:color w:val="808080"/>
-                <w:sz w:val="18"/>
-              </w:rPr>
-              <w:t>c_isa</w:t>
-            </w:r>
-            <w:proofErr w:type="spellEnd"/>
-            <w:r>
-              <w:rPr>
-                <w:color w:val="808080"/>
-                <w:sz w:val="18"/>
-              </w:rPr>
-              <w:t>}</w:t>
+              <w:t>{c_isa}</w:t>
             </w:r>
           </w:p>
         </w:tc>
@@ -1044,23 +883,7 @@
                 <w:color w:val="808080"/>
                 <w:sz w:val="18"/>
               </w:rPr>
-              <w:t>{</w:t>
-            </w:r>
-            <w:proofErr w:type="spellStart"/>
-            <w:r>
-              <w:rPr>
-                <w:color w:val="808080"/>
-                <w:sz w:val="18"/>
-              </w:rPr>
-              <w:t>c_imes</w:t>
-            </w:r>
-            <w:proofErr w:type="spellEnd"/>
-            <w:r>
-              <w:rPr>
-                <w:color w:val="808080"/>
-                <w:sz w:val="18"/>
-              </w:rPr>
-              <w:t>}</w:t>
+              <w:t>{c_imes}</w:t>
             </w:r>
           </w:p>
         </w:tc>
@@ -1235,7 +1058,23 @@
                 <w:spacing w:val="-5"/>
                 <w:sz w:val="18"/>
               </w:rPr>
-              <w:t>99</w:t>
+              <w:t>{n</w:t>
+            </w:r>
+            <w:r>
+              <w:rPr>
+                <w:color w:val="808080"/>
+                <w:spacing w:val="-5"/>
+                <w:sz w:val="18"/>
+              </w:rPr>
+              <w:t>d</w:t>
+            </w:r>
+            <w:r>
+              <w:rPr>
+                <w:color w:val="808080"/>
+                <w:spacing w:val="-5"/>
+                <w:sz w:val="18"/>
+              </w:rPr>
+              <w:t>}</w:t>
             </w:r>
           </w:p>
         </w:tc>
@@ -1256,38 +1095,21 @@
                 <w:color w:val="808080"/>
                 <w:sz w:val="18"/>
               </w:rPr>
-              <w:t>Ajuste</w:t>
-            </w:r>
-            <w:r>
-              <w:rPr>
-                <w:color w:val="808080"/>
-                <w:spacing w:val="-1"/>
-                <w:sz w:val="18"/>
-              </w:rPr>
-              <w:t xml:space="preserve"> </w:t>
-            </w:r>
-            <w:r>
-              <w:rPr>
-                <w:color w:val="808080"/>
-                <w:sz w:val="18"/>
-              </w:rPr>
-              <w:t>al</w:t>
-            </w:r>
-            <w:r>
-              <w:rPr>
-                <w:color w:val="808080"/>
-                <w:spacing w:val="-2"/>
-                <w:sz w:val="18"/>
-              </w:rPr>
-              <w:t xml:space="preserve"> </w:t>
-            </w:r>
-            <w:r>
-              <w:rPr>
-                <w:color w:val="808080"/>
-                <w:spacing w:val="-4"/>
-                <w:sz w:val="18"/>
-              </w:rPr>
-              <w:t>neto</w:t>
+              <w:t>{c</w:t>
+            </w:r>
+            <w:r>
+              <w:rPr>
+                <w:color w:val="808080"/>
+                <w:sz w:val="18"/>
+              </w:rPr>
+              <w:t>d</w:t>
+            </w:r>
+            <w:r>
+              <w:rPr>
+                <w:color w:val="808080"/>
+                <w:sz w:val="18"/>
+              </w:rPr>
+              <w:t>}</w:t>
             </w:r>
           </w:p>
         </w:tc>
@@ -1313,7 +1135,7 @@
                 <w:spacing w:val="-4"/>
                 <w:sz w:val="18"/>
               </w:rPr>
-              <w:t>{t11}</w:t>
+              <w:t>{t11d}</w:t>
             </w:r>
           </w:p>
         </w:tc>
@@ -1505,23 +1327,7 @@
                 <w:color w:val="808080"/>
                 <w:sz w:val="18"/>
               </w:rPr>
-              <w:t>{</w:t>
-            </w:r>
-            <w:proofErr w:type="spellStart"/>
-            <w:r>
-              <w:rPr>
-                <w:color w:val="808080"/>
-                <w:sz w:val="18"/>
-              </w:rPr>
-              <w:t>c_pant</w:t>
-            </w:r>
-            <w:proofErr w:type="spellEnd"/>
-            <w:r>
-              <w:rPr>
-                <w:color w:val="808080"/>
-                <w:sz w:val="18"/>
-              </w:rPr>
-              <w:t>}</w:t>
+              <w:t>{c_pant}</w:t>
             </w:r>
           </w:p>
         </w:tc>
@@ -1631,6 +1437,14 @@
                 <w:sz w:val="18"/>
               </w:rPr>
             </w:pPr>
+            <w:r>
+              <w:rPr>
+                <w:color w:val="808080"/>
+                <w:spacing w:val="-5"/>
+                <w:sz w:val="18"/>
+              </w:rPr>
+              <w:t>{np}</w:t>
+            </w:r>
           </w:p>
         </w:tc>
         <w:tc>
@@ -1648,6 +1462,13 @@
                 <w:sz w:val="18"/>
               </w:rPr>
             </w:pPr>
+            <w:r>
+              <w:rPr>
+                <w:color w:val="808080"/>
+                <w:sz w:val="18"/>
+              </w:rPr>
+              <w:t>{cp}</w:t>
+            </w:r>
           </w:p>
         </w:tc>
         <w:tc>
@@ -1667,6 +1488,14 @@
                 <w:sz w:val="18"/>
               </w:rPr>
             </w:pPr>
+            <w:r>
+              <w:rPr>
+                <w:color w:val="808080"/>
+                <w:spacing w:val="-4"/>
+                <w:sz w:val="18"/>
+              </w:rPr>
+              <w:t>{t11p}</w:t>
+            </w:r>
           </w:p>
         </w:tc>
         <w:tc>
@@ -1970,29 +1799,7 @@
                 <w:position w:val="3"/>
                 <w:sz w:val="18"/>
               </w:rPr>
-              <w:t>{</w:t>
-            </w:r>
-            <w:proofErr w:type="spellStart"/>
-            <w:r>
-              <w:rPr>
-                <w:rFonts w:ascii="Arial"/>
-                <w:b/>
-                <w:spacing w:val="-2"/>
-                <w:position w:val="3"/>
-                <w:sz w:val="18"/>
-              </w:rPr>
-              <w:t>suma_p</w:t>
-            </w:r>
-            <w:proofErr w:type="spellEnd"/>
-            <w:r>
-              <w:rPr>
-                <w:rFonts w:ascii="Arial"/>
-                <w:b/>
-                <w:spacing w:val="-2"/>
-                <w:position w:val="3"/>
-                <w:sz w:val="18"/>
-              </w:rPr>
-              <w:t>}</w:t>
+              <w:t>{suma_p}</w:t>
             </w:r>
           </w:p>
         </w:tc>
@@ -2096,29 +1903,7 @@
                 <w:position w:val="2"/>
                 <w:sz w:val="18"/>
               </w:rPr>
-              <w:t>{</w:t>
-            </w:r>
-            <w:proofErr w:type="spellStart"/>
-            <w:r>
-              <w:rPr>
-                <w:rFonts w:ascii="Arial"/>
-                <w:b/>
-                <w:spacing w:val="-2"/>
-                <w:position w:val="2"/>
-                <w:sz w:val="18"/>
-              </w:rPr>
-              <w:t>suma_d</w:t>
-            </w:r>
-            <w:proofErr w:type="spellEnd"/>
-            <w:r>
-              <w:rPr>
-                <w:rFonts w:ascii="Arial"/>
-                <w:b/>
-                <w:spacing w:val="-2"/>
-                <w:position w:val="2"/>
-                <w:sz w:val="18"/>
-              </w:rPr>
-              <w:t>}</w:t>
+              <w:t>{suma_d}</w:t>
             </w:r>
           </w:p>
         </w:tc>
@@ -2169,7 +1954,6 @@
                 <w:sz w:val="18"/>
               </w:rPr>
             </w:pPr>
-            <w:proofErr w:type="gramStart"/>
             <w:r>
               <w:rPr>
                 <w:rFonts w:ascii="Arial"/>
@@ -2212,7 +1996,6 @@
               </w:rPr>
               <w:t>Pagar</w:t>
             </w:r>
-            <w:proofErr w:type="gramEnd"/>
             <w:r>
               <w:rPr>
                 <w:rFonts w:ascii="Arial"/>
@@ -2247,29 +2030,7 @@
                 <w:position w:val="2"/>
                 <w:sz w:val="18"/>
               </w:rPr>
-              <w:t>{</w:t>
-            </w:r>
-            <w:proofErr w:type="spellStart"/>
-            <w:r>
-              <w:rPr>
-                <w:rFonts w:ascii="Arial"/>
-                <w:b/>
-                <w:spacing w:val="-2"/>
-                <w:position w:val="2"/>
-                <w:sz w:val="18"/>
-              </w:rPr>
-              <w:t>neto_p</w:t>
-            </w:r>
-            <w:proofErr w:type="spellEnd"/>
-            <w:r>
-              <w:rPr>
-                <w:rFonts w:ascii="Arial"/>
-                <w:b/>
-                <w:spacing w:val="-2"/>
-                <w:position w:val="2"/>
-                <w:sz w:val="18"/>
-              </w:rPr>
-              <w:t>}</w:t>
+              <w:t>{neto_p}</w:t>
             </w:r>
           </w:p>
         </w:tc>
@@ -2278,237 +2039,28 @@
     <w:p>
       <w:pPr>
         <w:pStyle w:val="Textoindependiente"/>
-        <w:ind w:left="513" w:right="873"/>
-        <w:jc w:val="both"/>
-      </w:pPr>
-    </w:p>
-    <w:p>
-      <w:pPr>
-        <w:pStyle w:val="Textoindependiente"/>
-        <w:ind w:left="513" w:right="873"/>
-        <w:jc w:val="both"/>
-      </w:pPr>
-    </w:p>
-    <w:p>
-      <w:pPr>
-        <w:pStyle w:val="Textoindependiente"/>
-        <w:ind w:left="513" w:right="873"/>
+        <w:spacing w:before="180"/>
+        <w:ind w:left="170" w:right="340"/>
         <w:jc w:val="both"/>
       </w:pPr>
       <w:r>
-        <w:t xml:space="preserve">Así mismo manifiesto que hasta el momento en que se da por terminada la relación laboral no se me adeuda ninguna cantidad de dinero por concepto de salarios devengados, diferencia de </w:t>
-      </w:r>
-      <w:proofErr w:type="gramStart"/>
-      <w:r>
-        <w:t>los mismos</w:t>
-      </w:r>
-      <w:proofErr w:type="gramEnd"/>
-      <w:r>
-        <w:t>, participación de utilidades, comisiones, horas extras, vacaciones, séptimos días, días festivos, prima dominical, vacacional y de antigüedad, y</w:t>
+        <w:t>Así mismo, una vez cubierto en su totalidad el importe antes señalado, la persona trabajadora manifiesta que no se le adeuda cantidad alguna por concepto de salarios devengados, diferencias de salario, participación de utilidades, comisiones, horas extras, vacaciones, séptimos días, días festivos, prima dominical, prima vacacional, prima de antigüedad y demás prestaciones que deriven de la relación laboral, al haber quedado comprendidas y liquidadas en los términos del presente finiquito.</w:t>
       </w:r>
       <w:r>
-        <w:rPr>
-          <w:spacing w:val="-4"/>
-        </w:rPr>
         <w:t xml:space="preserve"> </w:t>
       </w:r>
       <w:r>
-        <w:t>demás prestaciones que otorga la Ley</w:t>
-      </w:r>
-      <w:r>
-        <w:rPr>
-          <w:spacing w:val="40"/>
-        </w:rPr>
-        <w:t xml:space="preserve"> </w:t>
-      </w:r>
-      <w:r>
-        <w:t>Federal Del Trabajo, ya que las mismas siempre me fueron</w:t>
-      </w:r>
-      <w:r>
-        <w:rPr>
-          <w:spacing w:val="-1"/>
-        </w:rPr>
-        <w:t xml:space="preserve"> </w:t>
-      </w:r>
-      <w:r>
-        <w:t>íntegramente</w:t>
-      </w:r>
-      <w:r>
-        <w:rPr>
-          <w:spacing w:val="-1"/>
-        </w:rPr>
-        <w:t xml:space="preserve"> </w:t>
-      </w:r>
-      <w:r>
-        <w:t>cubiertas en los términos de</w:t>
-      </w:r>
-      <w:r>
-        <w:rPr>
-          <w:spacing w:val="-1"/>
-        </w:rPr>
-        <w:t xml:space="preserve"> </w:t>
-      </w:r>
-      <w:r>
-        <w:t>la</w:t>
-      </w:r>
-      <w:r>
-        <w:rPr>
-          <w:spacing w:val="-1"/>
-        </w:rPr>
-        <w:t xml:space="preserve"> </w:t>
-      </w:r>
-      <w:r>
-        <w:t>ley. También hago constar para</w:t>
-      </w:r>
-      <w:r>
-        <w:rPr>
-          <w:spacing w:val="-1"/>
-        </w:rPr>
-        <w:t xml:space="preserve"> </w:t>
-      </w:r>
-      <w:r>
-        <w:t>todos los efectos legales conducentes,</w:t>
-      </w:r>
-      <w:r>
-        <w:rPr>
-          <w:spacing w:val="40"/>
-        </w:rPr>
-        <w:t xml:space="preserve"> </w:t>
-      </w:r>
-      <w:r>
-        <w:t>que durante</w:t>
-      </w:r>
-      <w:r>
-        <w:rPr>
-          <w:spacing w:val="40"/>
-        </w:rPr>
-        <w:t xml:space="preserve"> </w:t>
-      </w:r>
-      <w:r>
-        <w:t>la vigencia de</w:t>
-      </w:r>
-      <w:r>
-        <w:rPr>
-          <w:spacing w:val="40"/>
-        </w:rPr>
-        <w:t xml:space="preserve"> </w:t>
-      </w:r>
-      <w:r>
-        <w:t>mi relación</w:t>
-      </w:r>
-      <w:r>
-        <w:rPr>
-          <w:spacing w:val="40"/>
-        </w:rPr>
-        <w:t xml:space="preserve"> </w:t>
-      </w:r>
-      <w:r>
-        <w:t>obrero-patronal</w:t>
-      </w:r>
-      <w:r>
-        <w:rPr>
-          <w:spacing w:val="40"/>
-        </w:rPr>
-        <w:t xml:space="preserve"> </w:t>
-      </w:r>
-      <w:r>
-        <w:t>no</w:t>
-      </w:r>
-      <w:r>
-        <w:rPr>
-          <w:spacing w:val="40"/>
-        </w:rPr>
-        <w:t xml:space="preserve"> </w:t>
-      </w:r>
-      <w:r>
-        <w:t>fui</w:t>
-      </w:r>
-      <w:r>
-        <w:rPr>
-          <w:spacing w:val="40"/>
-        </w:rPr>
-        <w:t xml:space="preserve"> </w:t>
-      </w:r>
-      <w:r>
-        <w:t>objeto de riesgo</w:t>
-      </w:r>
-      <w:r>
-        <w:rPr>
-          <w:spacing w:val="40"/>
-        </w:rPr>
-        <w:t xml:space="preserve"> </w:t>
-      </w:r>
-      <w:r>
-        <w:t>profesional alguno,</w:t>
-      </w:r>
-      <w:r>
-        <w:rPr>
-          <w:spacing w:val="40"/>
-        </w:rPr>
-        <w:t xml:space="preserve"> </w:t>
-      </w:r>
-      <w:r>
-        <w:t>motivo por el</w:t>
-      </w:r>
-      <w:r>
-        <w:rPr>
-          <w:spacing w:val="40"/>
-        </w:rPr>
-        <w:t xml:space="preserve"> </w:t>
-      </w:r>
-      <w:r>
-        <w:t>cual libero a mi</w:t>
-      </w:r>
-      <w:r>
-        <w:rPr>
-          <w:spacing w:val="40"/>
-        </w:rPr>
-        <w:t xml:space="preserve"> </w:t>
-      </w:r>
-      <w:r>
-        <w:t>patrón de</w:t>
-      </w:r>
-      <w:r>
-        <w:rPr>
-          <w:spacing w:val="40"/>
-        </w:rPr>
-        <w:t xml:space="preserve"> </w:t>
-      </w:r>
-      <w:r>
-        <w:t>toda responsabilidad</w:t>
-      </w:r>
-      <w:r>
-        <w:rPr>
-          <w:spacing w:val="40"/>
-        </w:rPr>
-        <w:t xml:space="preserve"> </w:t>
-      </w:r>
-      <w:r>
-        <w:t>laboral</w:t>
-      </w:r>
-      <w:r>
-        <w:rPr>
-          <w:spacing w:val="40"/>
-        </w:rPr>
-        <w:t xml:space="preserve"> </w:t>
-      </w:r>
-      <w:r>
-        <w:t>y de seguridad social o de cualquier</w:t>
-      </w:r>
-      <w:r>
-        <w:rPr>
-          <w:spacing w:val="40"/>
-        </w:rPr>
-        <w:t xml:space="preserve"> </w:t>
-      </w:r>
-      <w:r>
-        <w:t>otro concepto derivado del contrato de trabajo.</w:t>
+        <w:t>De igual forma, para todos los efectos legales conducentes, la persona trabajadora manifiesta que durante la vigencia de la relación laboral no fue objeto de riesgo profesional alguno no reportado, por lo que, una vez realizado el pago total del finiquito, otorga el más amplio recibo y finiquito que en derecho proceda respecto de las obligaciones laborales y de seguridad social derivadas de dicha relación.</w:t>
       </w:r>
     </w:p>
     <w:p>
       <w:pPr>
         <w:pStyle w:val="Textoindependiente"/>
-        <w:spacing w:before="180"/>
+        <w:ind w:right="195"/>
+        <w:jc w:val="center"/>
+        <w:rPr>
+          <w:spacing w:val="-2"/>
+        </w:rPr>
       </w:pPr>
     </w:p>
     <w:p>
@@ -2516,17 +2068,27 @@
         <w:pStyle w:val="Textoindependiente"/>
         <w:ind w:right="195"/>
         <w:jc w:val="center"/>
+        <w:rPr>
+          <w:b/>
+          <w:bCs/>
+        </w:rPr>
       </w:pPr>
       <w:r>
         <w:rPr>
+          <w:b/>
+          <w:bCs/>
           <w:spacing w:val="-2"/>
         </w:rPr>
         <w:t>ATENTAMENTE</w:t>
       </w:r>
     </w:p>
     <w:sectPr>
-      <w:headerReference w:type="default" r:id="rId6"/>
-      <w:footerReference w:type="default" r:id="rId7"/>
+      <w:headerReference w:type="even" r:id="rId6"/>
+      <w:headerReference w:type="default" r:id="rId7"/>
+      <w:footerReference w:type="even" r:id="rId8"/>
+      <w:footerReference w:type="default" r:id="rId9"/>
+      <w:headerReference w:type="first" r:id="rId10"/>
+      <w:footerReference w:type="first" r:id="rId11"/>
       <w:type w:val="continuous"/>
       <w:pgSz w:w="12240" w:h="15840"/>
       <w:pgMar w:top="1880" w:right="360" w:bottom="1020" w:left="720" w:header="912" w:footer="827" w:gutter="0"/>
@@ -2560,6 +2122,16 @@
 <w:ftr xmlns:wpc="http://schemas.microsoft.com/office/word/2010/wordprocessingCanvas" xmlns:cx="http://schemas.microsoft.com/office/drawing/2014/chartex" xmlns:cx1="http://schemas.microsoft.com/office/drawing/2015/9/8/chartex" xmlns:cx2="http://schemas.microsoft.com/office/drawing/2015/10/21/chartex" xmlns:cx3="http://schemas.microsoft.com/office/drawing/2016/5/9/chartex" xmlns:cx4="http://schemas.microsoft.com/office/drawing/2016/5/10/chartex" xmlns:cx5="http://schemas.microsoft.com/office/drawing/2016/5/11/chartex" xmlns:cx6="http://schemas.microsoft.com/office/drawing/2016/5/12/chartex" xmlns:cx7="http://schemas.microsoft.com/office/drawing/2016/5/13/chartex" xmlns:cx8="http://schemas.microsoft.com/office/drawing/2016/5/14/chartex" xmlns:mc="http://schemas.openxmlformats.org/markup-compatibility/2006" xmlns:aink="http://schemas.microsoft.com/office/drawing/2016/ink" xmlns:am3d="http://schemas.microsoft.com/office/drawing/2017/model3d" xmlns:o="urn:schemas-microsoft-com:office:office" xmlns:oel="http://schemas.microsoft.com/office/2019/extlst" xmlns:r="http://schemas.openxmlformats.org/officeDocument/2006/relationships" xmlns:m="http://schemas.openxmlformats.org/officeDocument/2006/math" xmlns:v="urn:schemas-microsoft-com:vml" xmlns:wp14="http://schemas.microsoft.com/office/word/2010/wordprocessingDrawing" xmlns:wp="http://schemas.openxmlformats.org/drawingml/2006/wordprocessingDrawing" xmlns:w10="urn:schemas-microsoft-com:office:word" xmlns:w="http://schemas.openxmlformats.org/wordprocessingml/2006/main" xmlns:w14="http://schemas.microsoft.com/office/word/2010/wordml" xmlns:w15="http://schemas.microsoft.com/office/word/2012/wordml" xmlns:w16cex="http://schemas.microsoft.com/office/word/2018/wordml/cex" xmlns:w16cid="http://schemas.microsoft.com/office/word/2016/wordml/cid" xmlns:w16="http://schemas.microsoft.com/office/word/2018/wordml" xmlns:w16du="http://schemas.microsoft.com/office/word/2023/wordml/word16du" xmlns:w16sdtdh="http://schemas.microsoft.com/office/word/2020/wordml/sdtdatahash" xmlns:w16sdtfl="http://schemas.microsoft.com/office/word/2024/wordml/sdtformatlock" xmlns:w16se="http://schemas.microsoft.com/office/word/2015/wordml/symex" xmlns:wpg="http://schemas.microsoft.com/office/word/2010/wordprocessingGroup" xmlns:wpi="http://schemas.microsoft.com/office/word/2010/wordprocessingInk" xmlns:wne="http://schemas.microsoft.com/office/word/2006/wordml" xmlns:wps="http://schemas.microsoft.com/office/word/2010/wordprocessingShape" mc:Ignorable="w14 w15 w16se w16cid w16 w16cex w16sdtdh w16sdtfl w16du wp14">
   <w:p>
     <w:pPr>
+      <w:pStyle w:val="Piedepgina"/>
+    </w:pPr>
+  </w:p>
+</w:ftr>
+</file>
+
+<file path=word/footer2.xml><?xml version="1.0" encoding="utf-8"?>
+<w:ftr xmlns:wpc="http://schemas.microsoft.com/office/word/2010/wordprocessingCanvas" xmlns:cx="http://schemas.microsoft.com/office/drawing/2014/chartex" xmlns:cx1="http://schemas.microsoft.com/office/drawing/2015/9/8/chartex" xmlns:cx2="http://schemas.microsoft.com/office/drawing/2015/10/21/chartex" xmlns:cx3="http://schemas.microsoft.com/office/drawing/2016/5/9/chartex" xmlns:cx4="http://schemas.microsoft.com/office/drawing/2016/5/10/chartex" xmlns:cx5="http://schemas.microsoft.com/office/drawing/2016/5/11/chartex" xmlns:cx6="http://schemas.microsoft.com/office/drawing/2016/5/12/chartex" xmlns:cx7="http://schemas.microsoft.com/office/drawing/2016/5/13/chartex" xmlns:cx8="http://schemas.microsoft.com/office/drawing/2016/5/14/chartex" xmlns:mc="http://schemas.openxmlformats.org/markup-compatibility/2006" xmlns:aink="http://schemas.microsoft.com/office/drawing/2016/ink" xmlns:am3d="http://schemas.microsoft.com/office/drawing/2017/model3d" xmlns:o="urn:schemas-microsoft-com:office:office" xmlns:oel="http://schemas.microsoft.com/office/2019/extlst" xmlns:r="http://schemas.openxmlformats.org/officeDocument/2006/relationships" xmlns:m="http://schemas.openxmlformats.org/officeDocument/2006/math" xmlns:v="urn:schemas-microsoft-com:vml" xmlns:wp14="http://schemas.microsoft.com/office/word/2010/wordprocessingDrawing" xmlns:wp="http://schemas.openxmlformats.org/drawingml/2006/wordprocessingDrawing" xmlns:w10="urn:schemas-microsoft-com:office:word" xmlns:w="http://schemas.openxmlformats.org/wordprocessingml/2006/main" xmlns:w14="http://schemas.microsoft.com/office/word/2010/wordml" xmlns:w15="http://schemas.microsoft.com/office/word/2012/wordml" xmlns:w16cex="http://schemas.microsoft.com/office/word/2018/wordml/cex" xmlns:w16cid="http://schemas.microsoft.com/office/word/2016/wordml/cid" xmlns:w16="http://schemas.microsoft.com/office/word/2018/wordml" xmlns:w16du="http://schemas.microsoft.com/office/word/2023/wordml/word16du" xmlns:w16sdtdh="http://schemas.microsoft.com/office/word/2020/wordml/sdtdatahash" xmlns:w16sdtfl="http://schemas.microsoft.com/office/word/2024/wordml/sdtformatlock" xmlns:w16se="http://schemas.microsoft.com/office/word/2015/wordml/symex" xmlns:wpg="http://schemas.microsoft.com/office/word/2010/wordprocessingGroup" xmlns:wpi="http://schemas.microsoft.com/office/word/2010/wordprocessingInk" xmlns:wne="http://schemas.microsoft.com/office/word/2006/wordml" xmlns:wps="http://schemas.microsoft.com/office/word/2010/wordprocessingShape" mc:Ignorable="w14 w15 w16se w16cid w16 w16cex w16sdtdh w16sdtfl w16du wp14">
+  <w:p>
+    <w:pPr>
       <w:pStyle w:val="Textoindependiente"/>
       <w:spacing w:line="14" w:lineRule="auto"/>
     </w:pPr>
@@ -2570,15 +2142,15 @@
       <mc:AlternateContent>
         <mc:Choice Requires="wps">
           <w:drawing>
-            <wp:anchor distT="0" distB="0" distL="0" distR="0" simplePos="0" relativeHeight="251658240" behindDoc="1" locked="0" layoutInCell="1" allowOverlap="1" wp14:anchorId="03A76DAF" wp14:editId="786E5A54">
+            <wp:anchor distT="0" distB="0" distL="0" distR="0" simplePos="0" relativeHeight="251658240" behindDoc="1" locked="0" layoutInCell="1" allowOverlap="1" wp14:anchorId="03A76DAF" wp14:editId="0B09F9B8">
               <wp:simplePos x="0" y="0"/>
               <wp:positionH relativeFrom="page">
-                <wp:posOffset>2838450</wp:posOffset>
+                <wp:align>left</wp:align>
               </wp:positionH>
               <wp:positionV relativeFrom="page">
-                <wp:posOffset>9486901</wp:posOffset>
+                <wp:posOffset>9485644</wp:posOffset>
               </wp:positionV>
-              <wp:extent cx="2266950" cy="152400"/>
+              <wp:extent cx="7757327" cy="152400"/>
               <wp:effectExtent l="0" t="0" r="0" b="0"/>
               <wp:wrapNone/>
               <wp:docPr id="3" name="Textbox 3"/>
@@ -2594,7 +2166,7 @@
                     <wps:spPr>
                       <a:xfrm>
                         <a:off x="0" y="0"/>
-                        <a:ext cx="2266950" cy="152400"/>
+                        <a:ext cx="7757327" cy="152400"/>
                       </a:xfrm>
                       <a:prstGeom prst="rect">
                         <a:avLst/>
@@ -2619,25 +2191,7 @@
                               <w:bCs/>
                               <w:spacing w:val="-2"/>
                             </w:rPr>
-                            <w:t>{</w:t>
-                          </w:r>
-                          <w:proofErr w:type="spellStart"/>
-                          <w:r>
-                            <w:rPr>
-                              <w:b/>
-                              <w:bCs/>
-                              <w:spacing w:val="-2"/>
-                            </w:rPr>
-                            <w:t>empleado_nombre_completo</w:t>
-                          </w:r>
-                          <w:proofErr w:type="spellEnd"/>
-                          <w:r>
-                            <w:rPr>
-                              <w:b/>
-                              <w:bCs/>
-                              <w:spacing w:val="-2"/>
-                            </w:rPr>
-                            <w:t>}</w:t>
+                            <w:t>{empleado_nombre_completo}</w:t>
                           </w:r>
                         </w:p>
                       </w:txbxContent>
@@ -2663,7 +2217,7 @@
               <v:stroke joinstyle="miter"/>
               <v:path gradientshapeok="t" o:connecttype="rect"/>
             </v:shapetype>
-            <v:shape id="Textbox 3" o:spid="_x0000_s1027" type="#_x0000_t202" style="position:absolute;margin-left:223.5pt;margin-top:747pt;width:178.5pt;height:12pt;z-index:-251658240;visibility:visible;mso-wrap-style:square;mso-width-percent:0;mso-height-percent:0;mso-wrap-distance-left:0;mso-wrap-distance-top:0;mso-wrap-distance-right:0;mso-wrap-distance-bottom:0;mso-position-horizontal:absolute;mso-position-horizontal-relative:page;mso-position-vertical:absolute;mso-position-vertical-relative:page;mso-width-percent:0;mso-height-percent:0;mso-width-relative:margin;mso-height-relative:margin;v-text-anchor:top" o:gfxdata="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" filled="f" stroked="f">
+            <v:shape id="Textbox 3" o:spid="_x0000_s1027" type="#_x0000_t202" style="position:absolute;margin-left:0;margin-top:746.9pt;width:610.8pt;height:12pt;z-index:-251658240;visibility:visible;mso-wrap-style:square;mso-width-percent:0;mso-height-percent:0;mso-wrap-distance-left:0;mso-wrap-distance-top:0;mso-wrap-distance-right:0;mso-wrap-distance-bottom:0;mso-position-horizontal:left;mso-position-horizontal-relative:page;mso-position-vertical:absolute;mso-position-vertical-relative:page;mso-width-percent:0;mso-height-percent:0;mso-width-relative:margin;mso-height-relative:margin;v-text-anchor:top" o:gfxdata="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" filled="f" stroked="f">
               <v:textbox inset="0,0,0,0">
                 <w:txbxContent>
                   <w:p>
@@ -2683,25 +2237,7 @@
                         <w:bCs/>
                         <w:spacing w:val="-2"/>
                       </w:rPr>
-                      <w:t>{</w:t>
-                    </w:r>
-                    <w:proofErr w:type="spellStart"/>
-                    <w:r>
-                      <w:rPr>
-                        <w:b/>
-                        <w:bCs/>
-                        <w:spacing w:val="-2"/>
-                      </w:rPr>
-                      <w:t>empleado_nombre_completo</w:t>
-                    </w:r>
-                    <w:proofErr w:type="spellEnd"/>
-                    <w:r>
-                      <w:rPr>
-                        <w:b/>
-                        <w:bCs/>
-                        <w:spacing w:val="-2"/>
-                      </w:rPr>
-                      <w:t>}</w:t>
+                      <w:t>{empleado_nombre_completo}</w:t>
                     </w:r>
                   </w:p>
                 </w:txbxContent>
@@ -2802,6 +2338,16 @@
 </w:ftr>
 </file>
 
+<file path=word/footer3.xml><?xml version="1.0" encoding="utf-8"?>
+<w:ftr xmlns:wpc="http://schemas.microsoft.com/office/word/2010/wordprocessingCanvas" xmlns:cx="http://schemas.microsoft.com/office/drawing/2014/chartex" xmlns:cx1="http://schemas.microsoft.com/office/drawing/2015/9/8/chartex" xmlns:cx2="http://schemas.microsoft.com/office/drawing/2015/10/21/chartex" xmlns:cx3="http://schemas.microsoft.com/office/drawing/2016/5/9/chartex" xmlns:cx4="http://schemas.microsoft.com/office/drawing/2016/5/10/chartex" xmlns:cx5="http://schemas.microsoft.com/office/drawing/2016/5/11/chartex" xmlns:cx6="http://schemas.microsoft.com/office/drawing/2016/5/12/chartex" xmlns:cx7="http://schemas.microsoft.com/office/drawing/2016/5/13/chartex" xmlns:cx8="http://schemas.microsoft.com/office/drawing/2016/5/14/chartex" xmlns:mc="http://schemas.openxmlformats.org/markup-compatibility/2006" xmlns:aink="http://schemas.microsoft.com/office/drawing/2016/ink" xmlns:am3d="http://schemas.microsoft.com/office/drawing/2017/model3d" xmlns:o="urn:schemas-microsoft-com:office:office" xmlns:oel="http://schemas.microsoft.com/office/2019/extlst" xmlns:r="http://schemas.openxmlformats.org/officeDocument/2006/relationships" xmlns:m="http://schemas.openxmlformats.org/officeDocument/2006/math" xmlns:v="urn:schemas-microsoft-com:vml" xmlns:wp14="http://schemas.microsoft.com/office/word/2010/wordprocessingDrawing" xmlns:wp="http://schemas.openxmlformats.org/drawingml/2006/wordprocessingDrawing" xmlns:w10="urn:schemas-microsoft-com:office:word" xmlns:w="http://schemas.openxmlformats.org/wordprocessingml/2006/main" xmlns:w14="http://schemas.microsoft.com/office/word/2010/wordml" xmlns:w15="http://schemas.microsoft.com/office/word/2012/wordml" xmlns:w16cex="http://schemas.microsoft.com/office/word/2018/wordml/cex" xmlns:w16cid="http://schemas.microsoft.com/office/word/2016/wordml/cid" xmlns:w16="http://schemas.microsoft.com/office/word/2018/wordml" xmlns:w16du="http://schemas.microsoft.com/office/word/2023/wordml/word16du" xmlns:w16sdtdh="http://schemas.microsoft.com/office/word/2020/wordml/sdtdatahash" xmlns:w16sdtfl="http://schemas.microsoft.com/office/word/2024/wordml/sdtformatlock" xmlns:w16se="http://schemas.microsoft.com/office/word/2015/wordml/symex" xmlns:wpg="http://schemas.microsoft.com/office/word/2010/wordprocessingGroup" xmlns:wpi="http://schemas.microsoft.com/office/word/2010/wordprocessingInk" xmlns:wne="http://schemas.microsoft.com/office/word/2006/wordml" xmlns:wps="http://schemas.microsoft.com/office/word/2010/wordprocessingShape" mc:Ignorable="w14 w15 w16se w16cid w16 w16cex w16sdtdh w16sdtfl w16du wp14">
+  <w:p>
+    <w:pPr>
+      <w:pStyle w:val="Piedepgina"/>
+    </w:pPr>
+  </w:p>
+</w:ftr>
+</file>
+
 <file path=word/footnotes.xml><?xml version="1.0" encoding="utf-8"?>
 <w:footnotes xmlns:wpc="http://schemas.microsoft.com/office/word/2010/wordprocessingCanvas" xmlns:cx="http://schemas.microsoft.com/office/drawing/2014/chartex" xmlns:cx1="http://schemas.microsoft.com/office/drawing/2015/9/8/chartex" xmlns:cx2="http://schemas.microsoft.com/office/drawing/2015/10/21/chartex" xmlns:cx3="http://schemas.microsoft.com/office/drawing/2016/5/9/chartex" xmlns:cx4="http://schemas.microsoft.com/office/drawing/2016/5/10/chartex" xmlns:cx5="http://schemas.microsoft.com/office/drawing/2016/5/11/chartex" xmlns:cx6="http://schemas.microsoft.com/office/drawing/2016/5/12/chartex" xmlns:cx7="http://schemas.microsoft.com/office/drawing/2016/5/13/chartex" xmlns:cx8="http://schemas.microsoft.com/office/drawing/2016/5/14/chartex" xmlns:mc="http://schemas.openxmlformats.org/markup-compatibility/2006" xmlns:aink="http://schemas.microsoft.com/office/drawing/2016/ink" xmlns:am3d="http://schemas.microsoft.com/office/drawing/2017/model3d" xmlns:o="urn:schemas-microsoft-com:office:office" xmlns:oel="http://schemas.microsoft.com/office/2019/extlst" xmlns:r="http://schemas.openxmlformats.org/officeDocument/2006/relationships" xmlns:m="http://schemas.openxmlformats.org/officeDocument/2006/math" xmlns:v="urn:schemas-microsoft-com:vml" xmlns:wp14="http://schemas.microsoft.com/office/word/2010/wordprocessingDrawing" xmlns:wp="http://schemas.openxmlformats.org/drawingml/2006/wordprocessingDrawing" xmlns:w10="urn:schemas-microsoft-com:office:word" xmlns:w="http://schemas.openxmlformats.org/wordprocessingml/2006/main" xmlns:w14="http://schemas.microsoft.com/office/word/2010/wordml" xmlns:w15="http://schemas.microsoft.com/office/word/2012/wordml" xmlns:w16cex="http://schemas.microsoft.com/office/word/2018/wordml/cex" xmlns:w16cid="http://schemas.microsoft.com/office/word/2016/wordml/cid" xmlns:w16="http://schemas.microsoft.com/office/word/2018/wordml" xmlns:w16du="http://schemas.microsoft.com/office/word/2023/wordml/word16du" xmlns:w16sdtdh="http://schemas.microsoft.com/office/word/2020/wordml/sdtdatahash" xmlns:w16sdtfl="http://schemas.microsoft.com/office/word/2024/wordml/sdtformatlock" xmlns:w16se="http://schemas.microsoft.com/office/word/2015/wordml/symex" xmlns:wpg="http://schemas.microsoft.com/office/word/2010/wordprocessingGroup" xmlns:wpi="http://schemas.microsoft.com/office/word/2010/wordprocessingInk" xmlns:wne="http://schemas.microsoft.com/office/word/2006/wordml" xmlns:wps="http://schemas.microsoft.com/office/word/2010/wordprocessingShape" mc:Ignorable="w14 w15 w16se w16cid w16 w16cex w16sdtdh w16sdtfl w16du wp14">
   <w:footnote w:type="separator" w:id="-1">
@@ -2822,6 +2368,16 @@
 </file>
 
 <file path=word/header1.xml><?xml version="1.0" encoding="utf-8"?>
+<w:hdr xmlns:wpc="http://schemas.microsoft.com/office/word/2010/wordprocessingCanvas" xmlns:cx="http://schemas.microsoft.com/office/drawing/2014/chartex" xmlns:cx1="http://schemas.microsoft.com/office/drawing/2015/9/8/chartex" xmlns:cx2="http://schemas.microsoft.com/office/drawing/2015/10/21/chartex" xmlns:cx3="http://schemas.microsoft.com/office/drawing/2016/5/9/chartex" xmlns:cx4="http://schemas.microsoft.com/office/drawing/2016/5/10/chartex" xmlns:cx5="http://schemas.microsoft.com/office/drawing/2016/5/11/chartex" xmlns:cx6="http://schemas.microsoft.com/office/drawing/2016/5/12/chartex" xmlns:cx7="http://schemas.microsoft.com/office/drawing/2016/5/13/chartex" xmlns:cx8="http://schemas.microsoft.com/office/drawing/2016/5/14/chartex" xmlns:mc="http://schemas.openxmlformats.org/markup-compatibility/2006" xmlns:aink="http://schemas.microsoft.com/office/drawing/2016/ink" xmlns:am3d="http://schemas.microsoft.com/office/drawing/2017/model3d" xmlns:o="urn:schemas-microsoft-com:office:office" xmlns:oel="http://schemas.microsoft.com/office/2019/extlst" xmlns:r="http://schemas.openxmlformats.org/officeDocument/2006/relationships" xmlns:m="http://schemas.openxmlformats.org/officeDocument/2006/math" xmlns:v="urn:schemas-microsoft-com:vml" xmlns:wp14="http://schemas.microsoft.com/office/word/2010/wordprocessingDrawing" xmlns:wp="http://schemas.openxmlformats.org/drawingml/2006/wordprocessingDrawing" xmlns:w10="urn:schemas-microsoft-com:office:word" xmlns:w="http://schemas.openxmlformats.org/wordprocessingml/2006/main" xmlns:w14="http://schemas.microsoft.com/office/word/2010/wordml" xmlns:w15="http://schemas.microsoft.com/office/word/2012/wordml" xmlns:w16cex="http://schemas.microsoft.com/office/word/2018/wordml/cex" xmlns:w16cid="http://schemas.microsoft.com/office/word/2016/wordml/cid" xmlns:w16="http://schemas.microsoft.com/office/word/2018/wordml" xmlns:w16du="http://schemas.microsoft.com/office/word/2023/wordml/word16du" xmlns:w16sdtdh="http://schemas.microsoft.com/office/word/2020/wordml/sdtdatahash" xmlns:w16sdtfl="http://schemas.microsoft.com/office/word/2024/wordml/sdtformatlock" xmlns:w16se="http://schemas.microsoft.com/office/word/2015/wordml/symex" xmlns:wpg="http://schemas.microsoft.com/office/word/2010/wordprocessingGroup" xmlns:wpi="http://schemas.microsoft.com/office/word/2010/wordprocessingInk" xmlns:wne="http://schemas.microsoft.com/office/word/2006/wordml" xmlns:wps="http://schemas.microsoft.com/office/word/2010/wordprocessingShape" mc:Ignorable="w14 w15 w16se w16cid w16 w16cex w16sdtdh w16sdtfl w16du wp14">
+  <w:p>
+    <w:pPr>
+      <w:pStyle w:val="Encabezado"/>
+    </w:pPr>
+  </w:p>
+</w:hdr>
+</file>
+
+<file path=word/header2.xml><?xml version="1.0" encoding="utf-8"?>
 <w:hdr xmlns:wpc="http://schemas.microsoft.com/office/word/2010/wordprocessingCanvas" xmlns:cx="http://schemas.microsoft.com/office/drawing/2014/chartex" xmlns:cx1="http://schemas.microsoft.com/office/drawing/2015/9/8/chartex" xmlns:cx2="http://schemas.microsoft.com/office/drawing/2015/10/21/chartex" xmlns:cx3="http://schemas.microsoft.com/office/drawing/2016/5/9/chartex" xmlns:cx4="http://schemas.microsoft.com/office/drawing/2016/5/10/chartex" xmlns:cx5="http://schemas.microsoft.com/office/drawing/2016/5/11/chartex" xmlns:cx6="http://schemas.microsoft.com/office/drawing/2016/5/12/chartex" xmlns:cx7="http://schemas.microsoft.com/office/drawing/2016/5/13/chartex" xmlns:cx8="http://schemas.microsoft.com/office/drawing/2016/5/14/chartex" xmlns:mc="http://schemas.openxmlformats.org/markup-compatibility/2006" xmlns:aink="http://schemas.microsoft.com/office/drawing/2016/ink" xmlns:am3d="http://schemas.microsoft.com/office/drawing/2017/model3d" xmlns:o="urn:schemas-microsoft-com:office:office" xmlns:oel="http://schemas.microsoft.com/office/2019/extlst" xmlns:r="http://schemas.openxmlformats.org/officeDocument/2006/relationships" xmlns:m="http://schemas.openxmlformats.org/officeDocument/2006/math" xmlns:v="urn:schemas-microsoft-com:vml" xmlns:wp14="http://schemas.microsoft.com/office/word/2010/wordprocessingDrawing" xmlns:wp="http://schemas.openxmlformats.org/drawingml/2006/wordprocessingDrawing" xmlns:w10="urn:schemas-microsoft-com:office:word" xmlns:w="http://schemas.openxmlformats.org/wordprocessingml/2006/main" xmlns:w14="http://schemas.microsoft.com/office/word/2010/wordml" xmlns:w15="http://schemas.microsoft.com/office/word/2012/wordml" xmlns:w16cex="http://schemas.microsoft.com/office/word/2018/wordml/cex" xmlns:w16cid="http://schemas.microsoft.com/office/word/2016/wordml/cid" xmlns:w16="http://schemas.microsoft.com/office/word/2018/wordml" xmlns:w16du="http://schemas.microsoft.com/office/word/2023/wordml/word16du" xmlns:w16sdtdh="http://schemas.microsoft.com/office/word/2020/wordml/sdtdatahash" xmlns:w16sdtfl="http://schemas.microsoft.com/office/word/2024/wordml/sdtformatlock" xmlns:w16se="http://schemas.microsoft.com/office/word/2015/wordml/symex" xmlns:wpg="http://schemas.microsoft.com/office/word/2010/wordprocessingGroup" xmlns:wpi="http://schemas.microsoft.com/office/word/2010/wordprocessingInk" xmlns:wne="http://schemas.microsoft.com/office/word/2006/wordml" xmlns:wps="http://schemas.microsoft.com/office/word/2010/wordprocessingShape" mc:Ignorable="w14 w15 w16se w16cid w16 w16cex w16sdtdh w16sdtfl w16du wp14">
   <w:p>
     <w:pPr>
@@ -3078,6 +2634,16 @@
     <w:pPr>
       <w:pStyle w:val="Textoindependiente"/>
       <w:spacing w:line="14" w:lineRule="auto"/>
+    </w:pPr>
+  </w:p>
+</w:hdr>
+</file>
+
+<file path=word/header3.xml><?xml version="1.0" encoding="utf-8"?>
+<w:hdr xmlns:wpc="http://schemas.microsoft.com/office/word/2010/wordprocessingCanvas" xmlns:cx="http://schemas.microsoft.com/office/drawing/2014/chartex" xmlns:cx1="http://schemas.microsoft.com/office/drawing/2015/9/8/chartex" xmlns:cx2="http://schemas.microsoft.com/office/drawing/2015/10/21/chartex" xmlns:cx3="http://schemas.microsoft.com/office/drawing/2016/5/9/chartex" xmlns:cx4="http://schemas.microsoft.com/office/drawing/2016/5/10/chartex" xmlns:cx5="http://schemas.microsoft.com/office/drawing/2016/5/11/chartex" xmlns:cx6="http://schemas.microsoft.com/office/drawing/2016/5/12/chartex" xmlns:cx7="http://schemas.microsoft.com/office/drawing/2016/5/13/chartex" xmlns:cx8="http://schemas.microsoft.com/office/drawing/2016/5/14/chartex" xmlns:mc="http://schemas.openxmlformats.org/markup-compatibility/2006" xmlns:aink="http://schemas.microsoft.com/office/drawing/2016/ink" xmlns:am3d="http://schemas.microsoft.com/office/drawing/2017/model3d" xmlns:o="urn:schemas-microsoft-com:office:office" xmlns:oel="http://schemas.microsoft.com/office/2019/extlst" xmlns:r="http://schemas.openxmlformats.org/officeDocument/2006/relationships" xmlns:m="http://schemas.openxmlformats.org/officeDocument/2006/math" xmlns:v="urn:schemas-microsoft-com:vml" xmlns:wp14="http://schemas.microsoft.com/office/word/2010/wordprocessingDrawing" xmlns:wp="http://schemas.openxmlformats.org/drawingml/2006/wordprocessingDrawing" xmlns:w10="urn:schemas-microsoft-com:office:word" xmlns:w="http://schemas.openxmlformats.org/wordprocessingml/2006/main" xmlns:w14="http://schemas.microsoft.com/office/word/2010/wordml" xmlns:w15="http://schemas.microsoft.com/office/word/2012/wordml" xmlns:w16cex="http://schemas.microsoft.com/office/word/2018/wordml/cex" xmlns:w16cid="http://schemas.microsoft.com/office/word/2016/wordml/cid" xmlns:w16="http://schemas.microsoft.com/office/word/2018/wordml" xmlns:w16du="http://schemas.microsoft.com/office/word/2023/wordml/word16du" xmlns:w16sdtdh="http://schemas.microsoft.com/office/word/2020/wordml/sdtdatahash" xmlns:w16sdtfl="http://schemas.microsoft.com/office/word/2024/wordml/sdtformatlock" xmlns:w16se="http://schemas.microsoft.com/office/word/2015/wordml/symex" xmlns:wpg="http://schemas.microsoft.com/office/word/2010/wordprocessingGroup" xmlns:wpi="http://schemas.microsoft.com/office/word/2010/wordprocessingInk" xmlns:wne="http://schemas.microsoft.com/office/word/2006/wordml" xmlns:wps="http://schemas.microsoft.com/office/word/2010/wordprocessingShape" mc:Ignorable="w14 w15 w16se w16cid w16 w16cex w16sdtdh w16sdtfl w16du wp14">
+  <w:p>
+    <w:pPr>
+      <w:pStyle w:val="Encabezado"/>
     </w:pPr>
   </w:p>
 </w:hdr>

</xml_diff>